<commit_message>
feat: add official Instagram links with white monochrome logo to all project profiles
</commit_message>
<xml_diff>
--- a/docs/Revelado Cultural- Info Landing .docx
+++ b/docs/Revelado Cultural- Info Landing .docx
@@ -81,24 +81,39 @@
       </w:r>
     </w:p>
     <w:p xmlns:wp14="http://schemas.microsoft.com/office/word/2010/wordml" wp14:textId="77777777">
-      <w:pPr>
-        <w:rPr>
-          <w:lang w:val="es-ES_tradnl"/>
-        </w:rPr>
-      </w:pPr>
-      <w:r>
-        <w:rPr>
-          <w:lang w:val="es-ES_tradnl"/>
+      <w:pPr/>
+      <w:r>
+        <w:rPr>
+          <w:lang w:val="es-ES"/>
         </w:rPr>
         <w:t xml:space="preserve">Nombre proyecto: </w:t>
       </w:r>
       <w:r>
+        <w:rPr/>
         <w:t>3er Festival Artes del Movimiento Arch</w:t>
       </w:r>
       <w:r>
+        <w:rPr/>
         <w:t>é</w:t>
       </w:r>
     </w:p>
+    <w:p>
+      <w:pPr>
+        <w:rPr>
+          <w:highlight w:val="yellow"/>
+        </w:rPr>
+      </w:pPr>
+      <w:r>
+        <w:rPr>
+          <w:highlight w:val="yellow"/>
+        </w:rPr>
+        <w:t>Instagram: arche_lab</w:t>
+      </w:r>
+      <w:r>
+        <w:rPr/>
+        <w:t xml:space="preserve"> </w:t>
+      </w:r>
+    </w:p>
     <w:p xmlns:wp14="http://schemas.microsoft.com/office/word/2010/wordml" wp14:textId="77777777">
       <w:pPr>
         <w:rPr>
@@ -118,27 +133,22 @@
         <w:t>Gestión Cultural</w:t>
       </w:r>
     </w:p>
-    <w:p xmlns:wp14="http://schemas.microsoft.com/office/word/2010/wordml" wp14:textId="77777777">
-      <w:pPr>
-        <w:rPr>
-          <w:lang w:val="es-ES_tradnl"/>
-        </w:rPr>
-      </w:pPr>
-      <w:r>
-        <w:rPr>
-          <w:lang w:val="es-ES_tradnl"/>
+    <w:p>
+      <w:r>
+        <w:rPr>
+          <w:lang w:val="es-ES"/>
         </w:rPr>
         <w:t>Breve descripción:</w:t>
       </w:r>
       <w:r>
         <w:rPr>
-          <w:lang w:val="es-ES_tradnl"/>
-        </w:rPr>
-        <w:t xml:space="preserve"> </w:t>
-      </w:r>
-      <w:r>
-        <w:rPr>
-          <w:lang w:val="es-ES_tradnl"/>
+          <w:lang w:val="es-ES"/>
+        </w:rPr>
+        <w:t xml:space="preserve"> </w:t>
+      </w:r>
+      <w:r>
+        <w:rPr>
+          <w:lang w:val="es-ES"/>
         </w:rPr>
         <w:t>Arché es un proyecto artístico y cultural que explora las posibilidades del movimiento a través de la danza, el teatro y el circo, integrando diferentes lenguajes escénicos para crear experiencias que conectan el cuerpo, la expresión y la creatividad.</w:t>
       </w:r>
@@ -391,22 +401,47 @@
       </w:pPr>
     </w:p>
     <w:p xmlns:wp14="http://schemas.microsoft.com/office/word/2010/wordml" wp14:textId="77777777">
-      <w:pPr>
-        <w:rPr>
-          <w:lang w:val="es-ES_tradnl"/>
-        </w:rPr>
-      </w:pPr>
-      <w:r>
-        <w:rPr>
-          <w:lang w:val="es-ES_tradnl"/>
+      <w:pPr/>
+      <w:r>
+        <w:rPr>
+          <w:lang w:val="es-ES"/>
         </w:rPr>
         <w:t xml:space="preserve">Nombre proyecto: </w:t>
       </w:r>
       <w:r>
         <w:rPr>
-          <w:lang w:val="es-ES_tradnl"/>
+          <w:lang w:val="es-ES"/>
         </w:rPr>
         <w:t xml:space="preserve">No entres Ahí </w:t>
+      </w:r>
+    </w:p>
+    <w:p>
+      <w:pPr>
+        <w:rPr>
+          <w:highlight w:val="yellow"/>
+          <w:lang w:val="es-ES"/>
+        </w:rPr>
+      </w:pPr>
+      <w:r>
+        <w:rPr>
+          <w:highlight w:val="yellow"/>
+          <w:lang w:val="es-ES"/>
+        </w:rPr>
+        <w:t xml:space="preserve">Instagram: </w:t>
+      </w:r>
+      <w:r>
+        <w:rPr>
+          <w:highlight w:val="yellow"/>
+          <w:lang w:val="es-ES"/>
+        </w:rPr>
+        <w:t>karlacuentera</w:t>
+      </w:r>
+      <w:r>
+        <w:rPr>
+          <w:highlight w:val="yellow"/>
+          <w:lang w:val="es-ES"/>
+        </w:rPr>
+        <w:t xml:space="preserve"> y davidhaceimpro</w:t>
       </w:r>
     </w:p>
     <w:p xmlns:wp14="http://schemas.microsoft.com/office/word/2010/wordml" wp14:textId="77777777">
@@ -505,40 +540,46 @@
         <w:t xml:space="preserve"> </w:t>
       </w:r>
     </w:p>
-    <w:p xmlns:wp14="http://schemas.microsoft.com/office/word/2010/wordml" wp14:textId="58CA7A9A">
-      <w:pPr>
+    <w:p xmlns:wp14="http://schemas.microsoft.com/office/word/2010/wordml" wp14:textId="367A2CE8">
+      <w:pPr/>
+      <w:r>
+        <w:rPr>
+          <w:color w:val="auto"/>
+          <w:highlight w:val="yellow"/>
+          <w:lang w:val="es-ES"/>
+        </w:rPr>
+        <w:t>Link</w:t>
+      </w:r>
+      <w:r>
+        <w:rPr>
+          <w:color w:val="auto"/>
+          <w:highlight w:val="yellow"/>
+          <w:lang w:val="es-ES"/>
+        </w:rPr>
+        <w:t xml:space="preserve"> de Podcast:</w:t>
+      </w:r>
+      <w:r>
         <w:rPr>
           <w:color w:val="FF0000"/>
           <w:lang w:val="es-ES"/>
         </w:rPr>
-      </w:pPr>
+        <w:t xml:space="preserve"> </w:t>
+      </w:r>
+      <w:hyperlink r:id="R3a38c2d6ee1b4ed8">
+        <w:r>
+          <w:rPr>
+            <w:rStyle w:val="Hipervnculo"/>
+            <w:lang w:val="es-ES"/>
+          </w:rPr>
+          <w:t>https://youtu.be/5KeLNSuAW9M</w:t>
+        </w:r>
+      </w:hyperlink>
       <w:r>
         <w:rPr>
           <w:color w:val="FF0000"/>
           <w:lang w:val="es-ES"/>
         </w:rPr>
-        <w:t>Link</w:t>
-      </w:r>
-      <w:r>
-        <w:rPr>
-          <w:color w:val="FF0000"/>
-          <w:lang w:val="es-ES"/>
-        </w:rPr>
-        <w:t xml:space="preserve"> de Podcast:</w:t>
-      </w:r>
-      <w:r>
-        <w:rPr>
-          <w:color w:val="FF0000"/>
-          <w:lang w:val="es-ES"/>
-        </w:rPr>
-        <w:t xml:space="preserve"> </w:t>
-      </w:r>
-      <w:r>
-        <w:rPr>
-          <w:color w:val="FF0000"/>
-          <w:lang w:val="es-ES"/>
-        </w:rPr>
-        <w:t xml:space="preserve">PENDIENTE </w:t>
+        <w:t xml:space="preserve"> </w:t>
       </w:r>
     </w:p>
     <w:p xmlns:wp14="http://schemas.microsoft.com/office/word/2010/wordml" wp14:textId="77777777">
@@ -623,22 +664,33 @@
       </w:r>
     </w:p>
     <w:p xmlns:wp14="http://schemas.microsoft.com/office/word/2010/wordml" wp14:textId="77777777">
-      <w:pPr>
-        <w:rPr>
-          <w:lang w:val="es-ES_tradnl"/>
-        </w:rPr>
-      </w:pPr>
-      <w:r>
-        <w:rPr>
-          <w:lang w:val="es-ES_tradnl"/>
+      <w:pPr/>
+      <w:r>
+        <w:rPr>
+          <w:lang w:val="es-ES"/>
         </w:rPr>
         <w:t xml:space="preserve">Nombre proyecto: </w:t>
       </w:r>
       <w:r>
         <w:rPr>
-          <w:lang w:val="es-ES_tradnl"/>
+          <w:lang w:val="es-ES"/>
         </w:rPr>
         <w:t>Ferales</w:t>
+      </w:r>
+    </w:p>
+    <w:p>
+      <w:pPr>
+        <w:rPr>
+          <w:highlight w:val="yellow"/>
+          <w:lang w:val="es-ES"/>
+        </w:rPr>
+      </w:pPr>
+      <w:r>
+        <w:rPr>
+          <w:highlight w:val="yellow"/>
+          <w:lang w:val="es-ES"/>
+        </w:rPr>
+        <w:t>Instagram: feralesmusica</w:t>
       </w:r>
     </w:p>
     <w:p xmlns:wp14="http://schemas.microsoft.com/office/word/2010/wordml" wp14:textId="77777777">
@@ -932,35 +984,66 @@
       </w:pPr>
     </w:p>
     <w:p xmlns:wp14="http://schemas.microsoft.com/office/word/2010/wordml" wp14:textId="77777777">
-      <w:pPr>
-        <w:rPr>
-          <w:lang w:val="es-ES_tradnl"/>
-        </w:rPr>
-      </w:pPr>
-      <w:r>
-        <w:rPr>
-          <w:lang w:val="es-ES_tradnl"/>
+      <w:pPr/>
+      <w:r>
+        <w:rPr>
+          <w:lang w:val="es-ES"/>
         </w:rPr>
         <w:t xml:space="preserve">Nombre proyecto: </w:t>
       </w:r>
       <w:r>
         <w:rPr>
-          <w:lang w:val="es-ES_tradnl"/>
+          <w:lang w:val="es-ES"/>
         </w:rPr>
         <w:t xml:space="preserve">Reflejos de Corporación H3 </w:t>
       </w:r>
     </w:p>
-    <w:p xmlns:wp14="http://schemas.microsoft.com/office/word/2010/wordml" wp14:textId="77777777">
-      <w:pPr>
-        <w:rPr>
-          <w:lang w:val="es-ES_tradnl"/>
-        </w:rPr>
-      </w:pPr>
-      <w:r>
-        <w:rPr>
-          <w:lang w:val="es-ES_tradnl"/>
-        </w:rPr>
-        <w:t xml:space="preserve">Área:  </w:t>
+    <w:p>
+      <w:pPr>
+        <w:rPr>
+          <w:highlight w:val="yellow"/>
+          <w:lang w:val="es-ES"/>
+        </w:rPr>
+      </w:pPr>
+      <w:r>
+        <w:rPr>
+          <w:highlight w:val="yellow"/>
+          <w:lang w:val="es-ES"/>
+        </w:rPr>
+        <w:t xml:space="preserve">Instagram: </w:t>
+      </w:r>
+      <w:r>
+        <w:rPr>
+          <w:highlight w:val="yellow"/>
+          <w:lang w:val="es-ES"/>
+        </w:rPr>
+        <w:t>compania</w:t>
+      </w:r>
+      <w:r>
+        <w:rPr>
+          <w:highlight w:val="yellow"/>
+          <w:lang w:val="es-ES"/>
+        </w:rPr>
+        <w:t>_h3</w:t>
+      </w:r>
+      <w:r>
+        <w:rPr>
+          <w:lang w:val="es-ES"/>
+        </w:rPr>
+        <w:t xml:space="preserve"> </w:t>
+      </w:r>
+    </w:p>
+    <w:p xmlns:wp14="http://schemas.microsoft.com/office/word/2010/wordml" wp14:textId="2FCA8C79">
+      <w:pPr>
+        <w:rPr>
+          <w:lang w:val="es-ES"/>
+        </w:rPr>
+      </w:pPr>
+      <w:r>
+        <w:rPr>
+          <w:lang w:val="es-ES"/>
+        </w:rPr>
+        <w:t xml:space="preserve">Área:  Danza </w:t>
       </w:r>
     </w:p>
     <w:p xmlns:wp14="http://schemas.microsoft.com/office/word/2010/wordml" wp14:textId="77777777">
@@ -1223,22 +1306,39 @@
       </w:pPr>
     </w:p>
     <w:p xmlns:wp14="http://schemas.microsoft.com/office/word/2010/wordml" wp14:textId="77777777">
-      <w:pPr>
-        <w:rPr>
-          <w:lang w:val="es-ES_tradnl"/>
-        </w:rPr>
-      </w:pPr>
-      <w:r>
-        <w:rPr>
-          <w:lang w:val="es-ES_tradnl"/>
+      <w:pPr/>
+      <w:r>
+        <w:rPr>
+          <w:lang w:val="es-ES"/>
         </w:rPr>
         <w:t xml:space="preserve">Nombre proyecto: </w:t>
       </w:r>
       <w:r>
         <w:rPr>
-          <w:lang w:val="es-ES_tradnl"/>
+          <w:lang w:val="es-ES"/>
         </w:rPr>
         <w:t xml:space="preserve">Tres Tristes Tigres </w:t>
+      </w:r>
+    </w:p>
+    <w:p>
+      <w:pPr>
+        <w:rPr>
+          <w:highlight w:val="yellow"/>
+          <w:lang w:val="es-ES"/>
+        </w:rPr>
+      </w:pPr>
+      <w:r>
+        <w:rPr>
+          <w:highlight w:val="yellow"/>
+          <w:lang w:val="es-ES"/>
+        </w:rPr>
+        <w:t>Instagram: 3t_festival</w:t>
+      </w:r>
+      <w:r>
+        <w:rPr>
+          <w:lang w:val="es-ES"/>
+        </w:rPr>
+        <w:t xml:space="preserve"> </w:t>
       </w:r>
     </w:p>
     <w:p xmlns:wp14="http://schemas.microsoft.com/office/word/2010/wordml" wp14:textId="77777777">
@@ -1569,15 +1669,30 @@
     <w:p xmlns:wp14="http://schemas.microsoft.com/office/word/2010/wordml" wp14:textId="77777777">
       <w:r>
         <w:rPr>
-          <w:lang w:val="es-ES_tradnl"/>
+          <w:lang w:val="es-ES"/>
         </w:rPr>
         <w:t xml:space="preserve">Nombre proyecto: </w:t>
       </w:r>
       <w:r>
+        <w:rPr/>
         <w:t>Pensar, narrar y habitar el territorio</w:t>
       </w:r>
       <w:r>
-        <w:t xml:space="preserve"> </w:t>
+        <w:rPr/>
+        <w:t xml:space="preserve"> </w:t>
+      </w:r>
+    </w:p>
+    <w:p>
+      <w:pPr>
+        <w:rPr>
+          <w:highlight w:val="yellow"/>
+        </w:rPr>
+      </w:pPr>
+      <w:r>
+        <w:rPr>
+          <w:highlight w:val="yellow"/>
+        </w:rPr>
+        <w:t>Instagram: habitar.elbarrio</w:t>
       </w:r>
     </w:p>
     <w:p xmlns:wp14="http://schemas.microsoft.com/office/word/2010/wordml" wp14:textId="77777777">
@@ -1799,7 +1914,7 @@
     <w:p xmlns:wp14="http://schemas.microsoft.com/office/word/2010/wordml" wp14:textId="77777777">
       <w:r>
         <w:rPr>
-          <w:lang w:val="es-ES_tradnl"/>
+          <w:lang w:val="es-ES"/>
         </w:rPr>
         <w:t>Nombre proyecto:</w:t>
       </w:r>
@@ -1816,38 +1931,53 @@
         <w:t xml:space="preserve"> </w:t>
       </w:r>
       <w:r>
+        <w:rPr/>
         <w:t>Narrar la realidad desde las viñetas: Un intercambio</w:t>
       </w:r>
     </w:p>
-    <w:p xmlns:wp14="http://schemas.microsoft.com/office/word/2010/wordml" wp14:textId="77777777">
-      <w:r>
+    <w:p>
+      <w:pPr>
+        <w:rPr>
+          <w:highlight w:val="yellow"/>
+        </w:rPr>
+      </w:pPr>
+      <w:r>
+        <w:rPr>
+          <w:highlight w:val="yellow"/>
+        </w:rPr>
+        <w:t>Instagram: altais_comics</w:t>
+      </w:r>
+    </w:p>
+    <w:p xmlns:wp14="http://schemas.microsoft.com/office/word/2010/wordml" wp14:textId="7CE70A63">
+      <w:pPr/>
+      <w:r>
+        <w:rPr/>
         <w:t xml:space="preserve">Lidera: </w:t>
       </w:r>
       <w:r>
+        <w:rPr/>
         <w:t xml:space="preserve">Lina Patricia </w:t>
       </w:r>
       <w:r>
+        <w:rPr/>
         <w:t>F</w:t>
       </w:r>
       <w:r>
+        <w:rPr/>
         <w:t>l</w:t>
       </w:r>
       <w:r>
+        <w:rPr/>
         <w:t>ó</w:t>
       </w:r>
       <w:r>
+        <w:rPr/>
         <w:t>re</w:t>
       </w:r>
       <w:r>
+        <w:rPr/>
         <w:t>z</w:t>
       </w:r>
-    </w:p>
-    <w:p xmlns:wp14="http://schemas.microsoft.com/office/word/2010/wordml" wp14:textId="77777777">
-      <w:pPr>
-        <w:rPr>
-          <w:lang w:val="es-ES_tradnl"/>
-        </w:rPr>
-      </w:pPr>
     </w:p>
     <w:p xmlns:wp14="http://schemas.microsoft.com/office/word/2010/wordml" wp14:textId="77777777">
       <w:pPr>
@@ -2079,35 +2209,39 @@
       </w:r>
     </w:p>
     <w:p xmlns:wp14="http://schemas.microsoft.com/office/word/2010/wordml" wp14:textId="77777777">
-      <w:pPr>
-        <w:rPr>
-          <w:lang w:val="es-ES_tradnl"/>
-        </w:rPr>
-      </w:pPr>
-      <w:r>
-        <w:rPr>
-          <w:lang w:val="es-ES_tradnl"/>
+      <w:pPr/>
+      <w:r>
+        <w:rPr>
+          <w:lang w:val="es-ES"/>
         </w:rPr>
         <w:t>Nombre proyecto:</w:t>
       </w:r>
       <w:r>
         <w:rPr>
-          <w:lang w:val="es-ES_tradnl"/>
+          <w:lang w:val="es-ES"/>
         </w:rPr>
         <w:t xml:space="preserve"> Se busca una Raíz </w:t>
       </w:r>
     </w:p>
-    <w:p xmlns:wp14="http://schemas.microsoft.com/office/word/2010/wordml" wp14:textId="77777777">
-      <w:pPr>
-        <w:rPr>
-          <w:lang w:val="es-ES_tradnl"/>
-        </w:rPr>
-      </w:pPr>
-      <w:r>
-        <w:rPr>
-          <w:lang w:val="es-ES_tradnl"/>
-        </w:rPr>
-        <w:t xml:space="preserve">Lidera: </w:t>
+    <w:p>
+      <w:pPr>
+        <w:rPr>
+          <w:highlight w:val="yellow"/>
+          <w:lang w:val="es-ES"/>
+        </w:rPr>
+      </w:pPr>
+      <w:r>
+        <w:rPr>
+          <w:highlight w:val="yellow"/>
+          <w:lang w:val="es-ES"/>
+        </w:rPr>
+        <w:t>Instagram: sebusca.unaraiz</w:t>
+      </w:r>
+      <w:r>
+        <w:rPr>
+          <w:lang w:val="es-ES"/>
+        </w:rPr>
+        <w:t xml:space="preserve"> </w:t>
       </w:r>
     </w:p>
     <w:p xmlns:wp14="http://schemas.microsoft.com/office/word/2010/wordml" wp14:textId="77777777">

</xml_diff>